<commit_message>
build(declaration): remove the table of contents
A 2-page contribution form does not need a TOC; drop it (and the now-unused
declmap/tab-stop code) so the document goes straight from the intro to the
contributions table.
</commit_message>
<xml_diff>
--- a/IFQ636 Assignment 2 - Declaration of contribution.docx
+++ b/IFQ636 Assignment 2 - Declaration of contribution.docx
@@ -60,83 +60,6 @@
           <w:color w:val="000000"/>
         </w:rPr>
         <w:t>assignment.</w:t>
-      </w:r>
-    </w:p>
-    <w:p>
-      <w:pPr>
-        <w:pStyle w:val="Heading1"/>
-      </w:pPr>
-      <w:r>
-        <w:t>Contents</w:t>
-      </w:r>
-    </w:p>
-    <w:p>
-      <w:pPr>
-        <w:tabs>
-          <w:tab w:pos="9072" w:val="right" w:leader="dot"/>
-        </w:tabs>
-      </w:pPr>
-      <w:r>
-        <w:rPr>
-          <w:rFonts w:ascii="Open Sans" w:hAnsi="Open Sans"/>
-          <w:b/>
-          <w:color w:val="000000"/>
-        </w:rPr>
-        <w:t>Team member details and contributions</w:t>
-      </w:r>
-      <w:r>
-        <w:rPr>
-          <w:rFonts w:ascii="Open Sans" w:hAnsi="Open Sans"/>
-          <w:color w:val="000000"/>
-        </w:rPr>
-        <w:tab/>
-        <w:t>1</w:t>
-      </w:r>
-    </w:p>
-    <w:p>
-      <w:pPr>
-        <w:tabs>
-          <w:tab w:pos="9072" w:val="right" w:leader="dot"/>
-        </w:tabs>
-      </w:pPr>
-      <w:r>
-        <w:rPr>
-          <w:rFonts w:ascii="Open Sans" w:hAnsi="Open Sans"/>
-          <w:b/>
-          <w:color w:val="000000"/>
-        </w:rPr>
-        <w:t>Declaration</w:t>
-      </w:r>
-      <w:r>
-        <w:rPr>
-          <w:rFonts w:ascii="Open Sans" w:hAnsi="Open Sans"/>
-          <w:color w:val="000000"/>
-        </w:rPr>
-        <w:tab/>
-        <w:t>2</w:t>
-      </w:r>
-    </w:p>
-    <w:p>
-      <w:pPr>
-        <w:tabs>
-          <w:tab w:pos="9072" w:val="right" w:leader="dot"/>
-        </w:tabs>
-      </w:pPr>
-      <w:r>
-        <w:rPr>
-          <w:rFonts w:ascii="Open Sans" w:hAnsi="Open Sans"/>
-          <w:b/>
-          <w:color w:val="000000"/>
-        </w:rPr>
-        <w:t>Signatures</w:t>
-      </w:r>
-      <w:r>
-        <w:rPr>
-          <w:rFonts w:ascii="Open Sans" w:hAnsi="Open Sans"/>
-          <w:color w:val="000000"/>
-        </w:rPr>
-        <w:tab/>
-        <w:t>2</w:t>
       </w:r>
     </w:p>
     <w:p>

</xml_diff>

<commit_message>
deliver: regenerate report + declaration DOCX/PDF with layout polish
Report now 86 pages (own-page references/appendices, section + heading
breaks, figure shadows, wider header gap). Declaration placeholders in red.
</commit_message>
<xml_diff>
--- a/IFQ636 Assignment 2 - Declaration of contribution.docx
+++ b/IFQ636 Assignment 2 - Declaration of contribution.docx
@@ -213,10 +213,10 @@
             <w:r>
               <w:rPr>
                 <w:rFonts w:ascii="Open Sans" w:hAnsi="Open Sans"/>
-                <w:b w:val="0"/>
-                <w:color w:val="000000"/>
-              </w:rPr>
-              <w:t>[AWAITING: student ID]</w:t>
+                <w:b/>
+                <w:color w:val="C00000"/>
+              </w:rPr>
+              <w:t>[PLACEHOLDER: student ID]</w:t>
             </w:r>
           </w:p>
         </w:tc>
@@ -278,10 +278,10 @@
             <w:r>
               <w:rPr>
                 <w:rFonts w:ascii="Open Sans" w:hAnsi="Open Sans"/>
-                <w:b w:val="0"/>
-                <w:color w:val="000000"/>
-              </w:rPr>
-              <w:t>[AWAITING: student ID]</w:t>
+                <w:b/>
+                <w:color w:val="C00000"/>
+              </w:rPr>
+              <w:t>[PLACEHOLDER: student ID]</w:t>
             </w:r>
           </w:p>
         </w:tc>
@@ -343,10 +343,10 @@
             <w:r>
               <w:rPr>
                 <w:rFonts w:ascii="Open Sans" w:hAnsi="Open Sans"/>
-                <w:b w:val="0"/>
-                <w:color w:val="000000"/>
-              </w:rPr>
-              <w:t>[AWAITING: student ID]</w:t>
+                <w:b/>
+                <w:color w:val="C00000"/>
+              </w:rPr>
+              <w:t>[PLACEHOLDER: student ID]</w:t>
             </w:r>
           </w:p>
         </w:tc>
@@ -664,10 +664,10 @@
             <w:r>
               <w:rPr>
                 <w:rFonts w:ascii="Open Sans" w:hAnsi="Open Sans"/>
-                <w:b w:val="0"/>
-                <w:color w:val="000000"/>
-              </w:rPr>
-              <w:t>[AWAITING: signature]</w:t>
+                <w:b/>
+                <w:color w:val="C00000"/>
+              </w:rPr>
+              <w:t>[PLACEHOLDER: signature]</w:t>
             </w:r>
           </w:p>
         </w:tc>
@@ -685,10 +685,10 @@
             <w:r>
               <w:rPr>
                 <w:rFonts w:ascii="Open Sans" w:hAnsi="Open Sans"/>
-                <w:b w:val="0"/>
-                <w:color w:val="000000"/>
-              </w:rPr>
-              <w:t>[AWAITING: date]</w:t>
+                <w:b/>
+                <w:color w:val="C00000"/>
+              </w:rPr>
+              <w:t>[PLACEHOLDER: date]</w:t>
             </w:r>
           </w:p>
         </w:tc>
@@ -729,10 +729,10 @@
             <w:r>
               <w:rPr>
                 <w:rFonts w:ascii="Open Sans" w:hAnsi="Open Sans"/>
-                <w:b w:val="0"/>
-                <w:color w:val="000000"/>
-              </w:rPr>
-              <w:t>[AWAITING: signature]</w:t>
+                <w:b/>
+                <w:color w:val="C00000"/>
+              </w:rPr>
+              <w:t>[PLACEHOLDER: signature]</w:t>
             </w:r>
           </w:p>
         </w:tc>
@@ -750,10 +750,10 @@
             <w:r>
               <w:rPr>
                 <w:rFonts w:ascii="Open Sans" w:hAnsi="Open Sans"/>
-                <w:b w:val="0"/>
-                <w:color w:val="000000"/>
-              </w:rPr>
-              <w:t>[AWAITING: date]</w:t>
+                <w:b/>
+                <w:color w:val="C00000"/>
+              </w:rPr>
+              <w:t>[PLACEHOLDER: date]</w:t>
             </w:r>
           </w:p>
         </w:tc>
@@ -794,10 +794,10 @@
             <w:r>
               <w:rPr>
                 <w:rFonts w:ascii="Open Sans" w:hAnsi="Open Sans"/>
-                <w:b w:val="0"/>
-                <w:color w:val="000000"/>
-              </w:rPr>
-              <w:t>[AWAITING: signature]</w:t>
+                <w:b/>
+                <w:color w:val="C00000"/>
+              </w:rPr>
+              <w:t>[PLACEHOLDER: signature]</w:t>
             </w:r>
           </w:p>
         </w:tc>
@@ -815,10 +815,10 @@
             <w:r>
               <w:rPr>
                 <w:rFonts w:ascii="Open Sans" w:hAnsi="Open Sans"/>
-                <w:b w:val="0"/>
-                <w:color w:val="000000"/>
-              </w:rPr>
-              <w:t>[AWAITING: date]</w:t>
+                <w:b/>
+                <w:color w:val="C00000"/>
+              </w:rPr>
+              <w:t>[PLACEHOLDER: date]</w:t>
             </w:r>
           </w:p>
         </w:tc>

</xml_diff>

<commit_message>
deliver: regenerate report and declaration DOCX/PDF
Rebuilds the report (86pp, TOC 0 mismatches, word count within budget) and the unsigned declaration from the updated sources.
</commit_message>
<xml_diff>
--- a/IFQ636 Assignment 2 - Declaration of contribution.docx
+++ b/IFQ636 Assignment 2 - Declaration of contribution.docx
@@ -213,10 +213,10 @@
             <w:r>
               <w:rPr>
                 <w:rFonts w:ascii="Open Sans" w:hAnsi="Open Sans"/>
-                <w:b/>
-                <w:color w:val="C00000"/>
-              </w:rPr>
-              <w:t>[PLACEHOLDER: student ID]</w:t>
+                <w:b w:val="0"/>
+                <w:color w:val="000000"/>
+              </w:rPr>
+              <w:t>n12555941</w:t>
             </w:r>
           </w:p>
         </w:tc>
@@ -237,7 +237,7 @@
                 <w:b w:val="0"/>
                 <w:color w:val="000000"/>
               </w:rPr>
-              <w:t>Coordinated the project and managed the GitHub workflow (issues, project board, branch/PR discipline, ~126 commits across 48 pull requests). Implemented the Singleton (database connection), Chain of Responsibility (middleware pipeline) and Decorator (withOwnership handler wrapper) patterns. Built the Postman auth/admin coverage and the live end-to-end collection run, added the PR-checks CI workflow and c8 code coverage, produced the load-test (NFR-01) evidence, and assembled the report draft including final QA, the GenAI disclosure and reflection sections, README, wireframes and system diagrams.</w:t>
+              <w:t>Coordinated the project and managed the GitHub workflow (issues, project board, branch/PR discipline, 118 commits across 59 pull requests). Implemented the Singleton (database connection), Chain of Responsibility (middleware pipeline) and Decorator (withOwnership handler wrapper) patterns. Built the Postman auth/admin coverage and the live end-to-end collection run, added the PR-checks CI workflow and c8 code coverage, produced the load-test (NFR-01) evidence, and assembled the report draft including final QA, the GenAI disclosure and reflection sections, README, wireframes and system diagrams.</w:t>
             </w:r>
           </w:p>
         </w:tc>
@@ -278,10 +278,10 @@
             <w:r>
               <w:rPr>
                 <w:rFonts w:ascii="Open Sans" w:hAnsi="Open Sans"/>
-                <w:b/>
-                <w:color w:val="C00000"/>
-              </w:rPr>
-              <w:t>[PLACEHOLDER: student ID]</w:t>
+                <w:b w:val="0"/>
+                <w:color w:val="000000"/>
+              </w:rPr>
+              <w:t>n8838411</w:t>
             </w:r>
           </w:p>
         </w:tc>
@@ -302,7 +302,7 @@
                 <w:b w:val="0"/>
                 <w:color w:val="000000"/>
               </w:rPr>
-              <w:t>Implemented the Factory Method (user-response construction), Facade (service-layer cascade deletes) and State (trip lifecycle) patterns. Set up the CI/CD deployment to AWS EC2 and wrote the Section 7 CI/CD write-up. Authored SRS Sections 2.6-2.7 (functional and non-functional requirements) and contributed the Postman trip-CRUD and State-transition request/response evidence. ~54 commits across 9 pull requests.</w:t>
+              <w:t>Implemented the Factory Method (user-response construction), Facade (service-layer cascade deletes) and State (trip lifecycle) patterns. Set up the CI/CD deployment to AWS EC2 and wrote the Section 7 CI/CD write-up. Authored SRS Sections 2.6-2.7 (functional and non-functional requirements) and contributed the Postman trip-CRUD and State-transition request/response evidence. 30 commits across 10 pull requests.</w:t>
             </w:r>
           </w:p>
         </w:tc>
@@ -343,10 +343,10 @@
             <w:r>
               <w:rPr>
                 <w:rFonts w:ascii="Open Sans" w:hAnsi="Open Sans"/>
-                <w:b/>
-                <w:color w:val="C00000"/>
-              </w:rPr>
-              <w:t>[PLACEHOLDER: student ID]</w:t>
+                <w:b w:val="0"/>
+                <w:color w:val="000000"/>
+              </w:rPr>
+              <w:t>n10813888</w:t>
             </w:r>
           </w:p>
         </w:tc>
@@ -367,7 +367,7 @@
                 <w:b w:val="0"/>
                 <w:color w:val="000000"/>
               </w:rPr>
-              <w:t>Implemented the Builder (trip query/update construction) and Adapter (Open-Meteo weather integration) patterns. Authored the project overview and SRS Sections 2.1-2.5 (purpose, problem, scope, users, constraints), the Discussion and conclusion, and the activity-CRUD and weather Postman evidence with test scripts. ~33 commits across 8 pull requests.</w:t>
+              <w:t>Implemented the Builder (trip query/update construction) and Adapter (Open-Meteo weather integration) patterns. Authored the project overview and SRS Sections 2.1-2.5 (purpose, problem, scope, users, constraints), the Discussion and conclusion, and the activity-CRUD and weather Postman evidence with test scripts. 21 commits across 8 pull requests.</w:t>
             </w:r>
           </w:p>
         </w:tc>

</xml_diff>